<commit_message>
db_normalization: add ER diagram to the docs
</commit_message>
<xml_diff>
--- a/docs/db_normalization/vet_clinic_project.docx
+++ b/docs/db_normalization/vet_clinic_project.docx
@@ -3370,33 +3370,94 @@
         </w:rPr>
         <w:t xml:space="preserve"> -&gt; </w:t>
       </w:r>
-      <w:r>
-        <w:rPr>
-          <w:rFonts w:ascii="Roboto Mono" w:cs="Roboto Mono" w:eastAsia="Roboto Mono" w:hAnsi="Roboto Mono"/>
-          <w:b w:val="1"/>
-          <w:bCs w:val="1"/>
-          <w:color w:val="b45f06"/>
-          <w:rtl w:val="0"/>
-        </w:rPr>
-        <w:t xml:space="preserve">pets.</w:t>
-      </w:r>
-      <w:r>
-        <w:rPr>
-          <w:rFonts w:ascii="Roboto Mono" w:cs="Roboto Mono" w:eastAsia="Roboto Mono" w:hAnsi="Roboto Mono"/>
-          <w:b w:val="1"/>
-          <w:bCs w:val="1"/>
-          <w:i w:val="1"/>
-          <w:iCs w:val="1"/>
-          <w:color w:val="134f5c"/>
-          <w:rtl w:val="0"/>
-        </w:rPr>
-        <w:t xml:space="preserve">id</w:t>
-      </w:r>
+      <w:hyperlink r:id="rId6">
+        <w:r>
+          <w:rPr>
+            <w:rFonts w:ascii="Roboto Mono" w:cs="Roboto Mono" w:eastAsia="Roboto Mono" w:hAnsi="Roboto Mono"/>
+            <w:b w:val="1"/>
+            <w:bCs w:val="1"/>
+            <w:color w:val="1155cc"/>
+            <w:u w:val="single"/>
+            <w:rtl w:val="0"/>
+          </w:rPr>
+          <w:t xml:space="preserve">pets.</w:t>
+        </w:r>
+      </w:hyperlink>
+      <w:hyperlink r:id="rId7">
+        <w:r>
+          <w:rPr>
+            <w:rFonts w:ascii="Roboto Mono" w:cs="Roboto Mono" w:eastAsia="Roboto Mono" w:hAnsi="Roboto Mono"/>
+            <w:b w:val="1"/>
+            <w:bCs w:val="1"/>
+            <w:i w:val="1"/>
+            <w:iCs w:val="1"/>
+            <w:color w:val="1155cc"/>
+            <w:u w:val="single"/>
+            <w:rtl w:val="0"/>
+          </w:rPr>
+          <w:t xml:space="preserve">id</w:t>
+        </w:r>
+      </w:hyperlink>
       <w:r>
         <w:rPr>
           <w:rtl w:val="0"/>
         </w:rPr>
         <w:t xml:space="preserve">).</w:t>
+      </w:r>
+    </w:p>
+    <w:p>
+      <w:pPr>
+        <w:pStyle w:val="Heading1"/>
+        <w:rPr/>
+      </w:pPr>
+      <w:bookmarkStart w:colFirst="0" w:colLast="0" w:name="_t2uq74gw3enw" w:id="5"/>
+      <w:bookmarkEnd w:id="5"/>
+      <w:r>
+        <w:rPr>
+          <w:rtl w:val="0"/>
+        </w:rPr>
+        <w:t xml:space="preserve">Part 4: ER diagram</w:t>
+      </w:r>
+    </w:p>
+    <w:p>
+      <w:pPr>
+        <w:ind w:right="0"/>
+        <w:rPr/>
+      </w:pPr>
+      <w:r>
+        <w:rPr/>
+        <w:drawing>
+          <wp:inline distB="114300" distT="114300" distL="114300" distR="114300">
+            <wp:extent cx="6472238" cy="3006640"/>
+            <wp:effectExtent b="0" l="0" r="0" t="0"/>
+            <wp:docPr id="1" name="image1.png"/>
+            <a:graphic>
+              <a:graphicData uri="http://schemas.openxmlformats.org/drawingml/2006/picture">
+                <pic:pic>
+                  <pic:nvPicPr>
+                    <pic:cNvPr id="0" name="image1.png"/>
+                    <pic:cNvPicPr preferRelativeResize="0"/>
+                  </pic:nvPicPr>
+                  <pic:blipFill>
+                    <a:blip r:embed="rId8"/>
+                    <a:srcRect b="0" l="0" r="0" t="0"/>
+                    <a:stretch>
+                      <a:fillRect/>
+                    </a:stretch>
+                  </pic:blipFill>
+                  <pic:spPr>
+                    <a:xfrm>
+                      <a:off x="0" y="0"/>
+                      <a:ext cx="6472238" cy="3006640"/>
+                    </a:xfrm>
+                    <a:prstGeom prst="rect"/>
+                    <a:ln/>
+                  </pic:spPr>
+                </pic:pic>
+              </a:graphicData>
+            </a:graphic>
+          </wp:inline>
+        </w:drawing>
       </w:r>
       <w:r>
         <w:rPr>

</xml_diff>